<commit_message>
docs: funciones adicionales definidas (tirillas, dashboard, auditoria, exportacion) + RNF-06 Netlify
</commit_message>
<xml_diff>
--- a/PROYECTO/ETAPA-1-IDEA/ETAPA-1-IDEA.docx
+++ b/PROYECTO/ETAPA-1-IDEA/ETAPA-1-IDEA.docx
@@ -681,6 +681,63 @@
       </w:pPr>
       <w:r>
         <w:t xml:space="preserve">Historial de movimientos y saldo actual por cliente.</w:t>
+      </w:r>
+    </w:p>
+    <w:p>
+      <w:pPr>
+        <w:pStyle w:val="Compact"/>
+        <w:numPr>
+          <w:ilvl w:val="0"/>
+          <w:numId w:val="1004"/>
+        </w:numPr>
+      </w:pPr>
+      <w:r>
+        <w:t xml:space="preserve">Cierre de turno del agenciero (tirilla): resumen por fecha y turno (mañana/tarde) con los créditos y débitos del día, premios, caja, diferencia arrastrada y conceptos variados (</w:t>
+      </w:r>
+      <w:r>
+        <w:t xml:space="preserve">“otros”</w:t>
+      </w:r>
+      <w:r>
+        <w:t xml:space="preserve"> </w:t>
+      </w:r>
+      <w:r>
+        <w:t xml:space="preserve">como limpieza); debajo, total de ventas, comisión del agenciero y la diferencia que falta para cuadrar. No modifica los saldos de los clientes.</w:t>
+      </w:r>
+    </w:p>
+    <w:p>
+      <w:pPr>
+        <w:pStyle w:val="Compact"/>
+        <w:numPr>
+          <w:ilvl w:val="0"/>
+          <w:numId w:val="1004"/>
+        </w:numPr>
+      </w:pPr>
+      <w:r>
+        <w:t xml:space="preserve">Dashboard del administrador: resumen de pendientes por confirmar, saldos por agencia y movimientos del día.</w:t>
+      </w:r>
+    </w:p>
+    <w:p>
+      <w:pPr>
+        <w:pStyle w:val="Compact"/>
+        <w:numPr>
+          <w:ilvl w:val="0"/>
+          <w:numId w:val="1004"/>
+        </w:numPr>
+      </w:pPr>
+      <w:r>
+        <w:t xml:space="preserve">Auditoría de quién y cuándo cargó, corrigió, confirmó o rechazó cada movimiento y cada tirilla.</w:t>
+      </w:r>
+    </w:p>
+    <w:p>
+      <w:pPr>
+        <w:pStyle w:val="Compact"/>
+        <w:numPr>
+          <w:ilvl w:val="0"/>
+          <w:numId w:val="1004"/>
+        </w:numPr>
+      </w:pPr>
+      <w:r>
+        <w:t xml:space="preserve">Exportación de planillas, tirillas y reportes a Excel o PDF.</w:t>
       </w:r>
     </w:p>
     <w:bookmarkEnd w:id="15"/>
@@ -1058,7 +1115,7 @@
               <w:pStyle w:val="Compact"/>
             </w:pPr>
             <w:r>
-              <w:t xml:space="preserve">El sistema debe mostrar al administrador un resumen de movimientos pendientes de confirmar y reportes de saldos.</w:t>
+              <w:t xml:space="preserve">El sistema debe mostrar al administrador un dashboard con el resumen de movimientos pendientes de confirmar, saldos por agencia y movimientos del día.</w:t>
             </w:r>
           </w:p>
         </w:tc>
@@ -1095,6 +1152,94 @@
             </w:r>
             <w:r>
               <w:t xml:space="preserve">(con su descripción) para arreglar errores, que pasa por el mismo flujo de confirmación y nunca modifica el movimiento original.</w:t>
+            </w:r>
+          </w:p>
+        </w:tc>
+      </w:tr>
+      <w:tr>
+        <w:tc>
+          <w:tcPr/>
+          <w:p>
+            <w:pPr>
+              <w:pStyle w:val="Compact"/>
+            </w:pPr>
+            <w:r>
+              <w:t xml:space="preserve">RF-12</w:t>
+            </w:r>
+          </w:p>
+        </w:tc>
+        <w:tc>
+          <w:tcPr/>
+          <w:p>
+            <w:pPr>
+              <w:pStyle w:val="Compact"/>
+            </w:pPr>
+            <w:r>
+              <w:t xml:space="preserve">El sistema debe permitir al agenciero cargar el cierre de turno (</w:t>
+            </w:r>
+            <w:r>
+              <w:rPr>
+                <w:b/>
+                <w:bCs/>
+              </w:rPr>
+              <w:t xml:space="preserve">tirilla</w:t>
+            </w:r>
+            <w:r>
+              <w:t xml:space="preserve">) con la fecha, el turno (mañana/tarde), los créditos y débitos del día, premios, caja, diferencia del día anterior y conceptos varios (</w:t>
+            </w:r>
+            <w:r>
+              <w:t xml:space="preserve">“otros”</w:t>
+            </w:r>
+            <w:r>
+              <w:t xml:space="preserve">, y pueden ser varios), y calcular el total de ventas, la comisión del agenciero y la diferencia que falta para cuadrar. El administrador debe poder verlas, corregirlas y auditar el histórico por agencia.</w:t>
+            </w:r>
+          </w:p>
+        </w:tc>
+      </w:tr>
+      <w:tr>
+        <w:tc>
+          <w:tcPr/>
+          <w:p>
+            <w:pPr>
+              <w:pStyle w:val="Compact"/>
+            </w:pPr>
+            <w:r>
+              <w:t xml:space="preserve">RF-13</w:t>
+            </w:r>
+          </w:p>
+        </w:tc>
+        <w:tc>
+          <w:tcPr/>
+          <w:p>
+            <w:pPr>
+              <w:pStyle w:val="Compact"/>
+            </w:pPr>
+            <w:r>
+              <w:t xml:space="preserve">El sistema debe registrar auditoría: quién y cuándo creó, modificó o confirmó cada movimiento y cada tirilla.</w:t>
+            </w:r>
+          </w:p>
+        </w:tc>
+      </w:tr>
+      <w:tr>
+        <w:tc>
+          <w:tcPr/>
+          <w:p>
+            <w:pPr>
+              <w:pStyle w:val="Compact"/>
+            </w:pPr>
+            <w:r>
+              <w:t xml:space="preserve">RF-14</w:t>
+            </w:r>
+          </w:p>
+        </w:tc>
+        <w:tc>
+          <w:tcPr/>
+          <w:p>
+            <w:pPr>
+              <w:pStyle w:val="Compact"/>
+            </w:pPr>
+            <w:r>
+              <w:t xml:space="preserve">El sistema debe permitir exportar planillas, tirillas y reportes de saldos a Excel o PDF.</w:t>
             </w:r>
           </w:p>
         </w:tc>
@@ -1430,6 +1575,54 @@
         <w:t xml:space="preserve">Panel de administración con pendientes de confirmar y reportes.</w:t>
       </w:r>
     </w:p>
+    <w:p>
+      <w:pPr>
+        <w:pStyle w:val="Compact"/>
+        <w:numPr>
+          <w:ilvl w:val="0"/>
+          <w:numId w:val="1007"/>
+        </w:numPr>
+      </w:pPr>
+      <w:r>
+        <w:t xml:space="preserve">Cierre de turno (tirillas) del agenciero.</w:t>
+      </w:r>
+    </w:p>
+    <w:p>
+      <w:pPr>
+        <w:pStyle w:val="Compact"/>
+        <w:numPr>
+          <w:ilvl w:val="0"/>
+          <w:numId w:val="1007"/>
+        </w:numPr>
+      </w:pPr>
+      <w:r>
+        <w:t xml:space="preserve">Exportación de planillas y reportes a Excel/PDF.</w:t>
+      </w:r>
+    </w:p>
+    <w:p>
+      <w:pPr>
+        <w:pStyle w:val="Compact"/>
+        <w:numPr>
+          <w:ilvl w:val="0"/>
+          <w:numId w:val="1007"/>
+        </w:numPr>
+      </w:pPr>
+      <w:r>
+        <w:t xml:space="preserve">Auditoría (quién y cuándo cargó/corrigió cada movimiento y tirilla).</w:t>
+      </w:r>
+    </w:p>
+    <w:p>
+      <w:pPr>
+        <w:pStyle w:val="Compact"/>
+        <w:numPr>
+          <w:ilvl w:val="0"/>
+          <w:numId w:val="1007"/>
+        </w:numPr>
+      </w:pPr>
+      <w:r>
+        <w:t xml:space="preserve">Dashboard/resumen general del administrador.</w:t>
+      </w:r>
+    </w:p>
     <w:bookmarkEnd w:id="21"/>
     <w:bookmarkStart w:id="22" w:name="could-have-deseables"/>
     <w:p>
@@ -1449,31 +1642,7 @@
         </w:numPr>
       </w:pPr>
       <w:r>
-        <w:t xml:space="preserve">Registro de auditoría (quién y cuándo cargó cada movimiento).</w:t>
-      </w:r>
-    </w:p>
-    <w:p>
-      <w:pPr>
-        <w:pStyle w:val="Compact"/>
-        <w:numPr>
-          <w:ilvl w:val="0"/>
-          <w:numId w:val="1008"/>
-        </w:numPr>
-      </w:pPr>
-      <w:r>
         <w:t xml:space="preserve">Notificaciones al cliente.</w:t>
-      </w:r>
-    </w:p>
-    <w:p>
-      <w:pPr>
-        <w:pStyle w:val="Compact"/>
-        <w:numPr>
-          <w:ilvl w:val="0"/>
-          <w:numId w:val="1008"/>
-        </w:numPr>
-      </w:pPr>
-      <w:r>
-        <w:t xml:space="preserve">Exportación de planillas y reportes.</w:t>
       </w:r>
     </w:p>
     <w:bookmarkEnd w:id="22"/>

</xml_diff>